<commit_message>
Fill Task 2 with Appendix 1 data; split Anton's workbook into two sheets
Anton: column 14 (profit from sales), Maksim: column 2 (headcount).
Word and Excel versions for both students now contain the full solution.

Co-Authored-By: Claude Opus 5.5 <noreply@anthropic.com>
Claude-Session: https://claude.ai/code/session_01JfCGfJiRYnzaYCvcSFBTpx
</commit_message>
<xml_diff>
--- a/Статистика_Вариант_1/Вершков_Максим_Вариант_1.docx
+++ b/Статистика_Вариант_1/Вершков_Максим_Вариант_1.docx
@@ -1912,7 +1912,7 @@
           <w:sz w:val="24"/>
           <w:szCs w:val="24"/>
         </w:rPr>
-        <w:t xml:space="preserve">Фамилия Вершков – буква В, по таблице это колонка 2 табл. 1 приложения 1 (___). Из 10 предприятий задачи 1 нужно случайно без повторения отобрать 3.</w:t>
+        <w:t xml:space="preserve">Фамилия Вершков – буква В, по таблице это колонка 2 табл. 1 приложения 1 (численность ППП, чел.). Из 10 предприятий задачи 1 нужно случайно без повторения отобрать 3.</w:t>
       </w:r>
     </w:p>
     <w:p>
@@ -2228,7 +2228,7 @@
                 <w:sz w:val="24"/>
                 <w:szCs w:val="24"/>
               </w:rPr>
-              <w:t xml:space="preserve">___</w:t>
+              <w:t xml:space="preserve">253</w:t>
             </w:r>
           </w:p>
         </w:tc>
@@ -2247,7 +2247,7 @@
                 <w:sz w:val="24"/>
                 <w:szCs w:val="24"/>
               </w:rPr>
-              <w:t xml:space="preserve">___</w:t>
+              <w:t xml:space="preserve">447</w:t>
             </w:r>
           </w:p>
         </w:tc>
@@ -2266,7 +2266,7 @@
                 <w:sz w:val="24"/>
                 <w:szCs w:val="24"/>
               </w:rPr>
-              <w:t xml:space="preserve">___</w:t>
+              <w:t xml:space="preserve">669</w:t>
             </w:r>
           </w:p>
         </w:tc>
@@ -2285,7 +2285,7 @@
                 <w:sz w:val="24"/>
                 <w:szCs w:val="24"/>
               </w:rPr>
-              <w:t xml:space="preserve">___</w:t>
+              <w:t xml:space="preserve">278</w:t>
             </w:r>
           </w:p>
         </w:tc>
@@ -2304,7 +2304,7 @@
                 <w:sz w:val="24"/>
                 <w:szCs w:val="24"/>
               </w:rPr>
-              <w:t xml:space="preserve">___</w:t>
+              <w:t xml:space="preserve">53</w:t>
             </w:r>
           </w:p>
         </w:tc>
@@ -2323,7 +2323,7 @@
                 <w:sz w:val="24"/>
                 <w:szCs w:val="24"/>
               </w:rPr>
-              <w:t xml:space="preserve">___</w:t>
+              <w:t xml:space="preserve">260</w:t>
             </w:r>
           </w:p>
         </w:tc>
@@ -2342,7 +2342,7 @@
                 <w:sz w:val="24"/>
                 <w:szCs w:val="24"/>
               </w:rPr>
-              <w:t xml:space="preserve">___</w:t>
+              <w:t xml:space="preserve">250</w:t>
             </w:r>
           </w:p>
         </w:tc>
@@ -2361,7 +2361,7 @@
                 <w:sz w:val="24"/>
                 <w:szCs w:val="24"/>
               </w:rPr>
-              <w:t xml:space="preserve">___</w:t>
+              <w:t xml:space="preserve">305</w:t>
             </w:r>
           </w:p>
         </w:tc>
@@ -2380,7 +2380,7 @@
                 <w:sz w:val="24"/>
                 <w:szCs w:val="24"/>
               </w:rPr>
-              <w:t xml:space="preserve">___</w:t>
+              <w:t xml:space="preserve">162</w:t>
             </w:r>
           </w:p>
         </w:tc>
@@ -2399,7 +2399,7 @@
                 <w:sz w:val="24"/>
                 <w:szCs w:val="24"/>
               </w:rPr>
-              <w:t xml:space="preserve">___</w:t>
+              <w:t xml:space="preserve">637</w:t>
             </w:r>
           </w:p>
         </w:tc>
@@ -2430,7 +2430,7 @@
           <w:sz w:val="24"/>
           <w:szCs w:val="24"/>
         </w:rPr>
-        <w:t xml:space="preserve">Σx = ___, средняя по 10 предприятиям x̄ген = ___ / 10 = ___.</w:t>
+        <w:t xml:space="preserve">Σx = 3314, средняя по 10 предприятиям x̄ген = 3314 / 10 = 331,4.</w:t>
       </w:r>
     </w:p>
     <w:p>
@@ -2486,7 +2486,7 @@
           <w:sz w:val="24"/>
           <w:szCs w:val="24"/>
         </w:rPr>
-        <w:t xml:space="preserve">x̄выб = (___ + ___ + ___) / 3 = ___.</w:t>
+        <w:t xml:space="preserve">x̄выб = (250 + 305 + 637) / 3 = 397,33.</w:t>
       </w:r>
     </w:p>
     <w:p>
@@ -2514,7 +2514,7 @@
           <w:sz w:val="24"/>
           <w:szCs w:val="24"/>
         </w:rPr>
-        <w:t xml:space="preserve">Всего 120 выборок, каждое предприятие входит в C(9,2) = 36 из них. Среднее из всех выборочных средних = (36 / 3 · Σx) / 120 = Σx / 10 = ___ / 10 = ___, это равно x̄ген = ___. Значит выборочная средняя несмещенная.</w:t>
+        <w:t xml:space="preserve">Всего 120 выборок, каждое предприятие входит в C(9,2) = 36 из них. Среднее из всех выборочных средних = (36 / 3 · Σx) / 120 = Σx / 10 = 3314 / 10 = 331,4, это равно x̄ген = 331,4. Значит выборочная средняя несмещенная.</w:t>
       </w:r>
     </w:p>
     <w:p>
@@ -2528,7 +2528,7 @@
           <w:sz w:val="24"/>
           <w:szCs w:val="24"/>
         </w:rPr>
-        <w:t xml:space="preserve">Наша выборка отличается от генеральной средней на ___ – это случайная ошибка из-за маленькой выборки, а не систематическая.</w:t>
+        <w:t xml:space="preserve">Наша выборка отличается от генеральной средней на 65,93 (у всех 120 выборок средняя от 155 до 584,33) – это случайная ошибка из-за маленькой выборки, а не систематическая.</w:t>
       </w:r>
     </w:p>
     <w:sectPr>

</xml_diff>